<commit_message>
Translate full Lobel Ilana document to Russian
https://claude.ai/code/session_01RmPX2FnwAMhZJTsjLdH3st
</commit_message>
<xml_diff>
--- a/Lobel_Ilana_FULL.docx
+++ b/Lobel_Ilana_FULL.docx
@@ -12,10 +12,9 @@
           <w:rFonts w:ascii="Arial" w:hAnsi="Arial"/>
           <w:b/>
           <w:i w:val="0"/>
-          <w:sz w:val="26"/>
-          <w:u w:val="none"/>
+          <w:sz w:val="28"/>
         </w:rPr>
-        <w:t>Заключення по тестуванню / Заключение по тестированию</w:t>
+        <w:t>Заключение по тестированию</w:t>
       </w:r>
     </w:p>
     <w:p>
@@ -29,7 +28,6 @@
           <w:b w:val="0"/>
           <w:i w:val="0"/>
           <w:sz w:val="22"/>
-          <w:u w:val="none"/>
         </w:rPr>
         <w:t>06.06.2026</w:t>
       </w:r>
@@ -49,6 +47,7 @@
       <w:r>
         <w:rPr>
           <w:rFonts w:ascii="Arial" w:hAnsi="Arial"/>
+          <w:sz w:val="22"/>
         </w:rPr>
         <w:br/>
         <w:t>+972543939238</w:t>
@@ -56,7 +55,7 @@
     </w:p>
     <w:p>
       <w:pPr>
-        <w:spacing w:before="160" w:after="80"/>
+        <w:spacing w:before="200" w:after="80"/>
       </w:pPr>
       <w:r>
         <w:rPr>
@@ -323,7 +322,7 @@
           <w:rFonts w:ascii="Arial" w:hAnsi="Arial"/>
           <w:sz w:val="22"/>
         </w:rPr>
-        <w:t xml:space="preserve"> (учащенному сердцебиению)</w:t>
+        <w:t xml:space="preserve"> (учащённому сердцебиению)</w:t>
       </w:r>
     </w:p>
     <w:p>
@@ -790,7 +789,7 @@
     </w:p>
     <w:p>
       <w:pPr>
-        <w:spacing w:before="40" w:after="40"/>
+        <w:spacing w:before="80" w:after="80"/>
         <w:pBdr>
           <w:bottom w:val="single" w:sz="4" w:space="1" w:color="AAAAAA"/>
         </w:pBdr>
@@ -798,7 +797,7 @@
     </w:p>
     <w:p>
       <w:pPr>
-        <w:spacing w:before="160" w:after="80"/>
+        <w:spacing w:before="200" w:after="80"/>
       </w:pPr>
       <w:r>
         <w:rPr>
@@ -822,14 +821,14 @@
           <w:b/>
           <w:sz w:val="22"/>
         </w:rPr>
-        <w:t>Активний рух</w:t>
+        <w:t>Активное движение</w:t>
       </w:r>
       <w:r>
         <w:rPr>
           <w:rFonts w:ascii="Arial" w:hAnsi="Arial"/>
           <w:sz w:val="22"/>
         </w:rPr>
-        <w:t xml:space="preserve"> — покращує кровообіг, обмін речовин і допомагає підтримувати нормальну вагу.</w:t>
+        <w:t xml:space="preserve"> — улучшает кровообращение, обмен веществ и помогает поддерживать нормальный вес.</w:t>
       </w:r>
     </w:p>
     <w:p>
@@ -843,14 +842,14 @@
           <w:b/>
           <w:sz w:val="22"/>
         </w:rPr>
-        <w:t>Уникати переохолодження</w:t>
+        <w:t>Избегать переохлаждения</w:t>
       </w:r>
       <w:r>
         <w:rPr>
           <w:rFonts w:ascii="Arial" w:hAnsi="Arial"/>
           <w:sz w:val="22"/>
         </w:rPr>
-        <w:t xml:space="preserve"> — холод може знижувати імунітет і погіршувати роботу організму.</w:t>
+        <w:t xml:space="preserve"> — холод может снижать иммунитет и ухудшать работу организма.</w:t>
       </w:r>
     </w:p>
     <w:p>
@@ -864,14 +863,14 @@
           <w:b/>
           <w:sz w:val="22"/>
         </w:rPr>
-        <w:t>Уникати перегріву</w:t>
+        <w:t>Избегать перегрева</w:t>
       </w:r>
       <w:r>
         <w:rPr>
           <w:rFonts w:ascii="Arial" w:hAnsi="Arial"/>
           <w:sz w:val="22"/>
         </w:rPr>
-        <w:t xml:space="preserve"> — перегрів створює навантаження на серце та може призводити до зневоднення.</w:t>
+        <w:t xml:space="preserve"> — перегрев создаёт нагрузку на сердце и может приводить к обезвоживанию.</w:t>
       </w:r>
     </w:p>
     <w:p>
@@ -885,14 +884,14 @@
           <w:b/>
           <w:sz w:val="22"/>
         </w:rPr>
-        <w:t>Сон 7–8 годин</w:t>
+        <w:t>Сон 7–8 часов</w:t>
       </w:r>
       <w:r>
         <w:rPr>
           <w:rFonts w:ascii="Arial" w:hAnsi="Arial"/>
           <w:sz w:val="22"/>
         </w:rPr>
-        <w:t xml:space="preserve"> — необхідний для відновлення організму та нормальної роботи нервової системи.</w:t>
+        <w:t xml:space="preserve"> — необходим для восстановления организма и нормальной работы нервной системы.</w:t>
       </w:r>
     </w:p>
     <w:p>
@@ -906,19 +905,19 @@
           <w:b/>
           <w:sz w:val="22"/>
         </w:rPr>
-        <w:t>Відбій о 22:00 (максимум до 23:00)</w:t>
+        <w:t>Отбой в 22:00 (максимум до 23:00)</w:t>
       </w:r>
       <w:r>
         <w:rPr>
           <w:rFonts w:ascii="Arial" w:hAnsi="Arial"/>
           <w:sz w:val="22"/>
         </w:rPr>
-        <w:t xml:space="preserve"> — ранній сон допомагає нормалізувати гормональний баланс і покращує відновлення організму.</w:t>
+        <w:t xml:space="preserve"> — ранний сон помогает нормализовать гормональный баланс и улучшает восстановление организма.</w:t>
       </w:r>
     </w:p>
     <w:p>
       <w:pPr>
-        <w:spacing w:before="40" w:after="40"/>
+        <w:spacing w:before="80" w:after="80"/>
         <w:pBdr>
           <w:bottom w:val="single" w:sz="4" w:space="1" w:color="AAAAAA"/>
         </w:pBdr>
@@ -926,7 +925,7 @@
     </w:p>
     <w:p>
       <w:pPr>
-        <w:spacing w:before="160" w:after="80"/>
+        <w:spacing w:before="200" w:after="80"/>
       </w:pPr>
       <w:r>
         <w:rPr>
@@ -936,7 +935,7 @@
           <w:sz w:val="22"/>
           <w:shd w:val="clear" w:color="auto" w:fill="9DC3E6"/>
         </w:rPr>
-        <w:t>Модифікація способу життя:</w:t>
+        <w:t>Модификация образа жизни:</w:t>
       </w:r>
     </w:p>
     <w:p>
@@ -950,13 +949,13 @@
           <w:b/>
           <w:sz w:val="22"/>
         </w:rPr>
-        <w:t>Знизити масу тіла</w:t>
+        <w:t>Снизить массу тела</w:t>
       </w:r>
     </w:p>
     <w:p>
       <w:pPr>
-        <w:pStyle w:val="ListBullet"/>
         <w:spacing w:before="0" w:after="60"/>
+        <w:ind w:left="480"/>
       </w:pPr>
       <w:r>
         <w:rPr>
@@ -964,7 +963,7 @@
           <w:i/>
           <w:sz w:val="22"/>
         </w:rPr>
-        <w:t>Зниження ваги допомагає зменшити навантаження на серце, суглоби, покращує обмін речовин і знижує рівень запалення.</w:t>
+        <w:t>Снижение веса помогает уменьшить нагрузку на сердце, суставы, улучшает обмен веществ и снижает уровень воспаления.</w:t>
       </w:r>
     </w:p>
     <w:p>
@@ -978,13 +977,13 @@
           <w:b/>
           <w:sz w:val="22"/>
         </w:rPr>
-        <w:t>Зменшити обхват талії до 78 см</w:t>
+        <w:t>Уменьшить обхват талии до 78 см</w:t>
       </w:r>
     </w:p>
     <w:p>
       <w:pPr>
-        <w:pStyle w:val="ListBullet"/>
         <w:spacing w:before="0" w:after="60"/>
+        <w:ind w:left="480"/>
       </w:pPr>
       <w:r>
         <w:rPr>
@@ -992,7 +991,7 @@
           <w:i/>
           <w:sz w:val="22"/>
         </w:rPr>
-        <w:t>Контроль талії важливий для зменшення вісцерального жиру (жиру навколо внутрішніх органів), який підвищує ризик метаболічних і гормональних порушень.</w:t>
+        <w:t>Контроль талии важен для уменьшения висцерального жира (жира вокруг внутренних органов), который повышает риск метаболических и гормональных нарушений.</w:t>
       </w:r>
     </w:p>
     <w:p>
@@ -1006,13 +1005,13 @@
           <w:b/>
           <w:sz w:val="22"/>
         </w:rPr>
-        <w:t>Дихальні вправи</w:t>
+        <w:t>Дыхательные упражнения</w:t>
       </w:r>
     </w:p>
     <w:p>
       <w:pPr>
-        <w:pStyle w:val="ListBullet"/>
         <w:spacing w:before="0" w:after="60"/>
+        <w:ind w:left="480"/>
       </w:pPr>
       <w:r>
         <w:rPr>
@@ -1020,13 +1019,13 @@
           <w:i/>
           <w:sz w:val="22"/>
         </w:rPr>
-        <w:t>На рахунок 1–2–3 — повільний вдих, надуваємо живіт.</w:t>
+        <w:t>На счёт 1–2–3 — медленный вдох, надуваем живот.</w:t>
       </w:r>
     </w:p>
     <w:p>
       <w:pPr>
-        <w:pStyle w:val="ListBullet"/>
         <w:spacing w:before="0" w:after="60"/>
+        <w:ind w:left="480"/>
       </w:pPr>
       <w:r>
         <w:rPr>
@@ -1034,13 +1033,13 @@
           <w:i/>
           <w:sz w:val="22"/>
         </w:rPr>
-        <w:t>На рахунок 1–2–3–4–5–6 — повільний видих, втягуємо живіт під ребра.</w:t>
+        <w:t>На счёт 1–2–3–4–5–6 — медленный выдох, втягиваем живот под рёбра.</w:t>
       </w:r>
     </w:p>
     <w:p>
       <w:pPr>
-        <w:pStyle w:val="ListBullet"/>
         <w:spacing w:before="0" w:after="60"/>
+        <w:ind w:left="480"/>
       </w:pPr>
       <w:r>
         <w:rPr>
@@ -1048,13 +1047,13 @@
           <w:i/>
           <w:sz w:val="22"/>
         </w:rPr>
-        <w:t>Виконувати 10–15 разів.</w:t>
+        <w:t>Выполнять 10–15 раз.</w:t>
       </w:r>
     </w:p>
     <w:p>
       <w:pPr>
-        <w:pStyle w:val="ListBullet"/>
         <w:spacing w:before="0" w:after="60"/>
+        <w:ind w:left="480"/>
       </w:pPr>
       <w:r>
         <w:rPr>
@@ -1062,7 +1061,7 @@
           <w:i/>
           <w:sz w:val="22"/>
         </w:rPr>
-        <w:t>Вправа покращує роботу діафрагми, активує м'язи живота, покращує насичення організму киснем і знижує рівень стресу.</w:t>
+        <w:t>Упражнение улучшает работу диафрагмы, активирует мышцы живота, улучшает насыщение организма кислородом и снижает уровень стресса.</w:t>
       </w:r>
     </w:p>
     <w:p>
@@ -1076,13 +1075,13 @@
           <w:b/>
           <w:sz w:val="22"/>
         </w:rPr>
-        <w:t>Тренування бодіфлекс по 30 хвилин на день</w:t>
+        <w:t>Тренировки бодифлекс по 30 минут в день</w:t>
       </w:r>
     </w:p>
     <w:p>
       <w:pPr>
-        <w:pStyle w:val="ListBullet"/>
         <w:spacing w:before="0" w:after="60"/>
+        <w:ind w:left="480"/>
       </w:pPr>
       <w:r>
         <w:rPr>
@@ -1090,13 +1089,13 @@
           <w:i/>
           <w:sz w:val="22"/>
         </w:rPr>
-        <w:t>Виконувати вранці натщесерце або через 2,5–3 години після їжі.</w:t>
+        <w:t>Выполнять утром натощак или через 2,5–3 часа после еды.</w:t>
       </w:r>
     </w:p>
     <w:p>
       <w:pPr>
-        <w:pStyle w:val="ListBullet"/>
         <w:spacing w:before="0" w:after="60"/>
+        <w:ind w:left="480"/>
       </w:pPr>
       <w:r>
         <w:rPr>
@@ -1104,7 +1103,7 @@
           <w:i/>
           <w:sz w:val="22"/>
         </w:rPr>
-        <w:t>Такі тренування активізують обмін речовин, зміцнюють м'язи та сприяють зменшенню об'ємів тіла.</w:t>
+        <w:t>Такие тренировки активизируют обмен веществ, укрепляют мышцы и способствуют уменьшению объёмов тела.</w:t>
       </w:r>
     </w:p>
     <w:p>
@@ -1118,13 +1117,13 @@
           <w:b/>
           <w:sz w:val="22"/>
         </w:rPr>
-        <w:t>Ходьба швидким кроком не менше 60 хвилин на день</w:t>
+        <w:t>Ходьба быстрым шагом не менее 60 минут в день</w:t>
       </w:r>
     </w:p>
     <w:p>
       <w:pPr>
-        <w:pStyle w:val="ListBullet"/>
         <w:spacing w:before="0" w:after="60"/>
+        <w:ind w:left="480"/>
       </w:pPr>
       <w:r>
         <w:rPr>
@@ -1132,7 +1131,7 @@
           <w:i/>
           <w:sz w:val="22"/>
         </w:rPr>
-        <w:t>Покращує роботу серцево-судинної системи, допомагає спалювати калорії та підтримує загальний рівень фізичної активності.</w:t>
+        <w:t>Улучшает работу сердечно-сосудистой системы, помогает сжигать калории и поддерживает общий уровень физической активности.</w:t>
       </w:r>
     </w:p>
     <w:p>
@@ -1146,13 +1145,13 @@
           <w:b/>
           <w:sz w:val="22"/>
         </w:rPr>
-        <w:t>Контрольні вимірювання вранці натщесерце 1 раз на тиждень</w:t>
+        <w:t>Контрольные измерения утром натощак 1 раз в неделю</w:t>
       </w:r>
     </w:p>
     <w:p>
       <w:pPr>
-        <w:pStyle w:val="ListBullet"/>
         <w:spacing w:before="0" w:after="60"/>
+        <w:ind w:left="480"/>
       </w:pPr>
       <w:r>
         <w:rPr>
@@ -1160,7 +1159,7 @@
           <w:i/>
           <w:sz w:val="22"/>
         </w:rPr>
-        <w:t>Регулярні вимірювання ваги та об'ємів допомагають відстежувати прогрес і коригувати програму за потреби.</w:t>
+        <w:t>Регулярные измерения веса и объёмов помогают отслеживать прогресс и корректировать программу при необходимости.</w:t>
       </w:r>
     </w:p>
     <w:p>
@@ -1174,13 +1173,13 @@
           <w:b/>
           <w:sz w:val="22"/>
         </w:rPr>
-        <w:t>Робота зі стресом</w:t>
+        <w:t>Работа со стрессом</w:t>
       </w:r>
     </w:p>
     <w:p>
       <w:pPr>
-        <w:pStyle w:val="ListBullet"/>
         <w:spacing w:before="0" w:after="60"/>
+        <w:ind w:left="480"/>
       </w:pPr>
       <w:r>
         <w:rPr>
@@ -1188,13 +1187,13 @@
           <w:i/>
           <w:sz w:val="22"/>
         </w:rPr>
-        <w:t>Зниження рівня стресу важливе для нормалізації гормонального фону, зменшення переїдання та покращення загального самопочуття.</w:t>
+        <w:t>Снижение уровня стресса важно для нормализации гормонального фона, уменьшения переедания и улучшения общего самочувствия.</w:t>
       </w:r>
     </w:p>
     <w:p>
       <w:pPr>
-        <w:pStyle w:val="ListBullet"/>
         <w:spacing w:before="0" w:after="60"/>
+        <w:ind w:left="480"/>
       </w:pPr>
       <w:r>
         <w:rPr>
@@ -1202,12 +1201,12 @@
           <w:i/>
           <w:sz w:val="22"/>
         </w:rPr>
-        <w:t>Можна використовувати дихальні практики, прогулянки, відпочинок і техніки розслаблення.</w:t>
+        <w:t>Можно использовать дыхательные практики, прогулки, отдых и техники расслабления.</w:t>
       </w:r>
     </w:p>
     <w:p>
       <w:pPr>
-        <w:spacing w:before="40" w:after="40"/>
+        <w:spacing w:before="80" w:after="80"/>
         <w:pBdr>
           <w:bottom w:val="single" w:sz="4" w:space="1" w:color="AAAAAA"/>
         </w:pBdr>
@@ -1215,7 +1214,7 @@
     </w:p>
     <w:p>
       <w:pPr>
-        <w:spacing w:before="160" w:after="80"/>
+        <w:spacing w:before="200" w:after="80"/>
       </w:pPr>
       <w:r>
         <w:rPr>
@@ -1225,7 +1224,7 @@
           <w:sz w:val="22"/>
           <w:shd w:val="clear" w:color="auto" w:fill="F4B942"/>
         </w:rPr>
-        <w:t>Режим харчування:</w:t>
+        <w:t>Режим питания:</w:t>
       </w:r>
     </w:p>
     <w:p>
@@ -1239,14 +1238,14 @@
           <w:b/>
           <w:sz w:val="22"/>
         </w:rPr>
-        <w:t>Дробне харчування (4–5 разів на добу)</w:t>
+        <w:t>Дробное питание (4–5 раз в сутки)</w:t>
       </w:r>
       <w:r>
         <w:rPr>
           <w:rFonts w:ascii="Arial" w:hAnsi="Arial"/>
           <w:sz w:val="22"/>
         </w:rPr>
-        <w:t xml:space="preserve"> — допомагає підтримувати стабільний рівень енергії та запобігає сильному відчуттю голоду і переїданню.</w:t>
+        <w:t xml:space="preserve"> — помогает поддерживать стабильный уровень энергии и предотвращает сильное чувство голода и переедание.</w:t>
       </w:r>
     </w:p>
     <w:p>
@@ -1265,20 +1264,20 @@
           <w:b/>
           <w:sz w:val="22"/>
         </w:rPr>
-        <w:t>Вода 1,5–2 л на день</w:t>
+        <w:t>Вода 1,5–2 л в день</w:t>
       </w:r>
       <w:r>
         <w:rPr>
           <w:rFonts w:ascii="Arial" w:hAnsi="Arial"/>
           <w:sz w:val="22"/>
         </w:rPr>
-        <w:t xml:space="preserve"> — підтримує обмін речовин і нормальну роботу організму.</w:t>
+        <w:t xml:space="preserve"> — поддерживает обмен веществ и нормальную работу организма.</w:t>
       </w:r>
     </w:p>
     <w:p>
       <w:pPr>
-        <w:pStyle w:val="ListBullet"/>
         <w:spacing w:before="0" w:after="60"/>
+        <w:ind w:left="480"/>
       </w:pPr>
       <w:r>
         <w:rPr>
@@ -1286,13 +1285,13 @@
           <w:i/>
           <w:sz w:val="22"/>
         </w:rPr>
-        <w:t>Вранці натщесерце — склянка теплої води з лимоном для м'якого запуску травлення.</w:t>
+        <w:t>Утром натощак — стакан тёплой воды с лимоном для мягкого запуска пищеварения.</w:t>
       </w:r>
     </w:p>
     <w:p>
       <w:pPr>
-        <w:pStyle w:val="ListBullet"/>
         <w:spacing w:before="0" w:after="60"/>
+        <w:ind w:left="480"/>
       </w:pPr>
       <w:r>
         <w:rPr>
@@ -1300,7 +1299,7 @@
           <w:i/>
           <w:sz w:val="22"/>
         </w:rPr>
-        <w:t>Перед кожним прийомом їжі — склянка теплої води для покращення роботи шлунка.</w:t>
+        <w:t>Перед каждым приёмом пищи — стакан тёплой воды для улучшения работы желудка.</w:t>
       </w:r>
     </w:p>
     <w:p>
@@ -1319,14 +1318,14 @@
           <w:b/>
           <w:sz w:val="22"/>
         </w:rPr>
-        <w:t>Розмір порції 250–300 г</w:t>
+        <w:t>Размер порции 250–300 г</w:t>
       </w:r>
       <w:r>
         <w:rPr>
           <w:rFonts w:ascii="Arial" w:hAnsi="Arial"/>
           <w:sz w:val="22"/>
         </w:rPr>
-        <w:t xml:space="preserve"> (для перших страв до 350 г, перекуси 100–150 г) — допомагає контролювати кількість їжі та не перевантажувати шлунок.</w:t>
+        <w:t xml:space="preserve"> (для первых блюд до 350 г, перекусы 100–150 г) — помогает контролировать количество еды и не перегружать желудок.</w:t>
       </w:r>
     </w:p>
     <w:p>
@@ -1345,20 +1344,20 @@
           <w:b/>
           <w:sz w:val="22"/>
         </w:rPr>
-        <w:t>Ретельно пережовувати їжу до рідкого стану</w:t>
+        <w:t>Тщательно пережёвывать пищу до жидкого состояния</w:t>
       </w:r>
       <w:r>
         <w:rPr>
           <w:rFonts w:ascii="Arial" w:hAnsi="Arial"/>
           <w:sz w:val="22"/>
         </w:rPr>
-        <w:t xml:space="preserve"> — це полегшує травлення та покращує засвоєння поживних речовин.</w:t>
+        <w:t xml:space="preserve"> — облегчает пищеварение и улучшает усвоение питательных веществ.</w:t>
       </w:r>
     </w:p>
     <w:p>
       <w:pPr>
-        <w:pStyle w:val="ListBullet"/>
         <w:spacing w:before="0" w:after="60"/>
+        <w:ind w:left="480"/>
       </w:pPr>
       <w:r>
         <w:rPr>
@@ -1366,7 +1365,7 @@
           <w:i/>
           <w:sz w:val="22"/>
         </w:rPr>
-        <w:t>Прийом їжі має тривати 15–25 хвилин, щоб організм встиг відчути насичення. (перекус якщо м'який або рідкий 5–10 хвилин).</w:t>
+        <w:t>Приём пищи должен длиться 15–25 минут, чтобы организм успел почувствовать насыщение. (перекус если мягкий или жидкий 5–10 минут).</w:t>
       </w:r>
     </w:p>
     <w:p>
@@ -1385,19 +1384,19 @@
           <w:b/>
           <w:sz w:val="22"/>
         </w:rPr>
-        <w:t>Проміжки між прийомами їжі близько 3 годин</w:t>
+        <w:t>Промежутки между приёмами пищи около 3 часов</w:t>
       </w:r>
       <w:r>
         <w:rPr>
           <w:rFonts w:ascii="Arial" w:hAnsi="Arial"/>
           <w:sz w:val="22"/>
         </w:rPr>
-        <w:t xml:space="preserve"> — допомагають підтримувати стабільний рівень цукру в крові, рівень енергії та запобігають переїданню.</w:t>
+        <w:t xml:space="preserve"> — помогают поддерживать стабильный уровень сахара в крови, уровень энергии и предотвращают переедание.</w:t>
       </w:r>
     </w:p>
     <w:p>
       <w:pPr>
-        <w:spacing w:before="40" w:after="40"/>
+        <w:spacing w:before="80" w:after="80"/>
         <w:pBdr>
           <w:bottom w:val="single" w:sz="4" w:space="1" w:color="AAAAAA"/>
         </w:pBdr>
@@ -1405,7 +1404,7 @@
     </w:p>
     <w:p>
       <w:pPr>
-        <w:spacing w:before="160" w:after="80"/>
+        <w:spacing w:before="200" w:after="80"/>
       </w:pPr>
       <w:r>
         <w:rPr>
@@ -1415,7 +1414,7 @@
           <w:sz w:val="22"/>
           <w:shd w:val="clear" w:color="auto" w:fill="A8D08D"/>
         </w:rPr>
-        <w:t>Харчування:</w:t>
+        <w:t>Питание:</w:t>
       </w:r>
     </w:p>
     <w:p>
@@ -1428,9 +1427,8 @@
           <w:b/>
           <w:i w:val="0"/>
           <w:sz w:val="22"/>
-          <w:u w:val="none"/>
         </w:rPr>
-        <w:t>Обмежити до 100 г на тиждень:</w:t>
+        <w:t>Ограничить до 100 г в неделю:</w:t>
       </w:r>
     </w:p>
     <w:p>
@@ -1444,14 +1442,14 @@
           <w:b/>
           <w:sz w:val="22"/>
         </w:rPr>
-        <w:t>Продукти з глютеном</w:t>
+        <w:t>Продукты с глютеном</w:t>
       </w:r>
       <w:r>
         <w:rPr>
           <w:rFonts w:ascii="Arial" w:hAnsi="Arial"/>
           <w:sz w:val="22"/>
         </w:rPr>
-        <w:t xml:space="preserve"> (пшениця, жито, вівсянка, манка, булгур, перловка, полба, макарони, випічка) — можуть перевантажувати травлення та провокувати запальні реакції.</w:t>
+        <w:t xml:space="preserve"> (пшеница, рожь, овсянка, манка, булгур, перловка, полба, макароны, выпечка) — могут перегружать пищеварение и провоцировать воспалительные реакции.</w:t>
       </w:r>
     </w:p>
     <w:p>
@@ -1479,14 +1477,14 @@
           <w:b/>
           <w:sz w:val="22"/>
         </w:rPr>
-        <w:t>М'ясо: свинина, телятина, баранина</w:t>
+        <w:t>Мясо: свинина, телятина, баранина</w:t>
       </w:r>
       <w:r>
         <w:rPr>
           <w:rFonts w:ascii="Arial" w:hAnsi="Arial"/>
           <w:sz w:val="22"/>
         </w:rPr>
-        <w:t xml:space="preserve"> — важко перетравлюється та перевантажує травну систему.</w:t>
+        <w:t xml:space="preserve"> — тяжело переваривается и перегружает пищеварительную систему.</w:t>
       </w:r>
     </w:p>
     <w:p>
@@ -1500,14 +1498,14 @@
           <w:b/>
           <w:sz w:val="22"/>
         </w:rPr>
-        <w:t>Продукти з харчовими добавками</w:t>
+        <w:t>Продукты с пищевыми добавками</w:t>
       </w:r>
       <w:r>
         <w:rPr>
           <w:rFonts w:ascii="Arial" w:hAnsi="Arial"/>
           <w:sz w:val="22"/>
         </w:rPr>
-        <w:t xml:space="preserve"> — негативно впливають на обмін речовин і мікрофлору кишечника.</w:t>
+        <w:t xml:space="preserve"> — негативно влияют на обмен веществ и микрофлору кишечника.</w:t>
       </w:r>
     </w:p>
     <w:p>
@@ -1521,14 +1519,14 @@
           <w:b/>
           <w:sz w:val="22"/>
         </w:rPr>
-        <w:t>Газовані та солодкі напої</w:t>
+        <w:t>Газированные и сладкие напитки</w:t>
       </w:r>
       <w:r>
         <w:rPr>
           <w:rFonts w:ascii="Arial" w:hAnsi="Arial"/>
           <w:sz w:val="22"/>
         </w:rPr>
-        <w:t xml:space="preserve"> — містять багато цукру та порушують обмін речовин.</w:t>
+        <w:t xml:space="preserve"> — содержат много сахара и нарушают обмен веществ.</w:t>
       </w:r>
     </w:p>
     <w:p>
@@ -1542,14 +1540,14 @@
           <w:b/>
           <w:sz w:val="22"/>
         </w:rPr>
-        <w:t>Солодощі</w:t>
+        <w:t>Сладости</w:t>
       </w:r>
       <w:r>
         <w:rPr>
           <w:rFonts w:ascii="Arial" w:hAnsi="Arial"/>
           <w:sz w:val="22"/>
         </w:rPr>
-        <w:t xml:space="preserve"> — викликають різкі коливання рівня цукру в крові та сприяють набору ваги.</w:t>
+        <w:t xml:space="preserve"> — вызывают резкие колебания уровня сахара в крови и способствуют набору веса.</w:t>
       </w:r>
     </w:p>
     <w:p>
@@ -1563,14 +1561,14 @@
           <w:b/>
           <w:sz w:val="22"/>
         </w:rPr>
-        <w:t>Продукти з дріжджами</w:t>
+        <w:t>Продукты с дрожжами</w:t>
       </w:r>
       <w:r>
         <w:rPr>
           <w:rFonts w:ascii="Arial" w:hAnsi="Arial"/>
           <w:sz w:val="22"/>
         </w:rPr>
-        <w:t xml:space="preserve"> (випічка, пиво, квас) — можуть спричиняти бродіння в кишечнику.</w:t>
+        <w:t xml:space="preserve"> (выпечка, пиво, квас) — могут вызывать брожение в кишечнике.</w:t>
       </w:r>
     </w:p>
     <w:p>
@@ -1591,7 +1589,7 @@
           <w:rFonts w:ascii="Arial" w:hAnsi="Arial"/>
           <w:sz w:val="22"/>
         </w:rPr>
-        <w:t xml:space="preserve"> — перевантажує печінку та порушує обмін речовин.</w:t>
+        <w:t xml:space="preserve"> — перегружает печень и нарушает обмен веществ.</w:t>
       </w:r>
     </w:p>
     <w:p>
@@ -1605,14 +1603,14 @@
           <w:b/>
           <w:sz w:val="22"/>
         </w:rPr>
-        <w:t>Оцет, крім яблучного</w:t>
+        <w:t>Уксус, кроме яблочного</w:t>
       </w:r>
       <w:r>
         <w:rPr>
           <w:rFonts w:ascii="Arial" w:hAnsi="Arial"/>
           <w:sz w:val="22"/>
         </w:rPr>
-        <w:t xml:space="preserve"> — може подразнювати слизову шлунка.</w:t>
+        <w:t xml:space="preserve"> — может раздражать слизистую желудка.</w:t>
       </w:r>
     </w:p>
     <w:p>
@@ -1626,14 +1624,14 @@
           <w:b/>
           <w:sz w:val="22"/>
         </w:rPr>
-        <w:t>Свіжа випічка та варене тісто</w:t>
+        <w:t>Свежая выпечка и варёное тесто</w:t>
       </w:r>
       <w:r>
         <w:rPr>
           <w:rFonts w:ascii="Arial" w:hAnsi="Arial"/>
           <w:sz w:val="22"/>
         </w:rPr>
-        <w:t xml:space="preserve"> — важко перетравлюються та викликають бродіння.</w:t>
+        <w:t xml:space="preserve"> — тяжело перевариваются и вызывают брожение.</w:t>
       </w:r>
     </w:p>
     <w:p>
@@ -1646,9 +1644,8 @@
           <w:b/>
           <w:i w:val="0"/>
           <w:sz w:val="22"/>
-          <w:u w:val="none"/>
         </w:rPr>
-        <w:t>Обмежити способи приготування:</w:t>
+        <w:t>Ограничить способы приготовления:</w:t>
       </w:r>
     </w:p>
     <w:p>
@@ -1662,14 +1659,14 @@
           <w:b/>
           <w:sz w:val="22"/>
         </w:rPr>
-        <w:t>Смажене</w:t>
+        <w:t>Жареное</w:t>
       </w:r>
       <w:r>
         <w:rPr>
           <w:rFonts w:ascii="Arial" w:hAnsi="Arial"/>
           <w:sz w:val="22"/>
         </w:rPr>
-        <w:t xml:space="preserve"> — містить надлишок жирів і погіршує травлення.</w:t>
+        <w:t xml:space="preserve"> — содержит избыток жиров и ухудшает пищеварение.</w:t>
       </w:r>
     </w:p>
     <w:p>
@@ -1683,14 +1680,14 @@
           <w:b/>
           <w:sz w:val="22"/>
         </w:rPr>
-        <w:t>Гостре</w:t>
+        <w:t>Острое</w:t>
       </w:r>
       <w:r>
         <w:rPr>
           <w:rFonts w:ascii="Arial" w:hAnsi="Arial"/>
           <w:sz w:val="22"/>
         </w:rPr>
-        <w:t xml:space="preserve"> — подразнює слизову шлунка.</w:t>
+        <w:t xml:space="preserve"> — раздражает слизистую желудка.</w:t>
       </w:r>
     </w:p>
     <w:p>
@@ -1704,14 +1701,14 @@
           <w:b/>
           <w:sz w:val="22"/>
         </w:rPr>
-        <w:t>Копчене</w:t>
+        <w:t>Копчёное</w:t>
       </w:r>
       <w:r>
         <w:rPr>
           <w:rFonts w:ascii="Arial" w:hAnsi="Arial"/>
           <w:sz w:val="22"/>
         </w:rPr>
-        <w:t xml:space="preserve"> — містить шкідливі речовини та перевантажує печінку.</w:t>
+        <w:t xml:space="preserve"> — содержит вредные вещества и перегружает печень.</w:t>
       </w:r>
     </w:p>
     <w:p>
@@ -1725,14 +1722,14 @@
           <w:b/>
           <w:sz w:val="22"/>
         </w:rPr>
-        <w:t>Консервоване</w:t>
+        <w:t>Консервированное</w:t>
       </w:r>
       <w:r>
         <w:rPr>
           <w:rFonts w:ascii="Arial" w:hAnsi="Arial"/>
           <w:sz w:val="22"/>
         </w:rPr>
-        <w:t xml:space="preserve"> — містить багато солі та добавок.</w:t>
+        <w:t xml:space="preserve"> — содержит много соли и добавок.</w:t>
       </w:r>
     </w:p>
     <w:p>
@@ -1746,14 +1743,14 @@
           <w:b/>
           <w:sz w:val="22"/>
         </w:rPr>
-        <w:t>Свіжа випічка</w:t>
+        <w:t>Свежая выпечка</w:t>
       </w:r>
       <w:r>
         <w:rPr>
           <w:rFonts w:ascii="Arial" w:hAnsi="Arial"/>
           <w:sz w:val="22"/>
         </w:rPr>
-        <w:t xml:space="preserve"> — викликає бродіння та важкість у шлунку.</w:t>
+        <w:t xml:space="preserve"> — вызывает брожение и тяжесть в желудке.</w:t>
       </w:r>
     </w:p>
     <w:p>
@@ -1766,9 +1763,8 @@
           <w:b/>
           <w:i w:val="0"/>
           <w:sz w:val="22"/>
-          <w:u w:val="none"/>
         </w:rPr>
-        <w:t>Рекомендується вживати як основний раціон:</w:t>
+        <w:t>Рекомендуется употреблять как основной рацион:</w:t>
       </w:r>
     </w:p>
     <w:p>
@@ -1782,14 +1778,14 @@
           <w:b/>
           <w:sz w:val="22"/>
         </w:rPr>
-        <w:t>Овочі та зелень 250–300 г на день</w:t>
+        <w:t>Овощи и зелень 250–300 г в день</w:t>
       </w:r>
       <w:r>
         <w:rPr>
           <w:rFonts w:ascii="Arial" w:hAnsi="Arial"/>
           <w:sz w:val="22"/>
         </w:rPr>
-        <w:t xml:space="preserve"> — джерело клітковини, вітамінів і підтримка роботи кишечника.</w:t>
+        <w:t xml:space="preserve"> — источник клетчатки, витаминов и поддержка работы кишечника.</w:t>
       </w:r>
     </w:p>
     <w:p>
@@ -1803,20 +1799,20 @@
           <w:b/>
           <w:sz w:val="22"/>
         </w:rPr>
-        <w:t>Яйця 2 шт на день</w:t>
+        <w:t>Яйца 2 шт в день</w:t>
       </w:r>
       <w:r>
         <w:rPr>
           <w:rFonts w:ascii="Arial" w:hAnsi="Arial"/>
           <w:sz w:val="22"/>
         </w:rPr>
-        <w:t xml:space="preserve"> — джерело повноцінного білка та корисних жирів.</w:t>
+        <w:t xml:space="preserve"> — источник полноценного белка и полезных жиров.</w:t>
       </w:r>
     </w:p>
     <w:p>
       <w:pPr>
-        <w:pStyle w:val="ListBullet"/>
         <w:spacing w:before="0" w:after="60"/>
+        <w:ind w:left="480"/>
       </w:pPr>
       <w:r>
         <w:rPr>
@@ -1824,7 +1820,7 @@
           <w:i/>
           <w:sz w:val="22"/>
         </w:rPr>
-        <w:t>Краще вранці, з рідким жовтком.</w:t>
+        <w:t>Лучше утром, с жидким желтком.</w:t>
       </w:r>
     </w:p>
     <w:p>
@@ -1838,14 +1834,14 @@
           <w:b/>
           <w:sz w:val="22"/>
         </w:rPr>
-        <w:t>Ягоди до 100 г на день</w:t>
+        <w:t>Ягоды до 100 г в день</w:t>
       </w:r>
       <w:r>
         <w:rPr>
           <w:rFonts w:ascii="Arial" w:hAnsi="Arial"/>
           <w:sz w:val="22"/>
         </w:rPr>
-        <w:t xml:space="preserve"> — містять антиоксиданти та підтримують імунітет.</w:t>
+        <w:t xml:space="preserve"> — содержат антиоксиданты и поддерживают иммунитет.</w:t>
       </w:r>
     </w:p>
     <w:p>
@@ -1859,20 +1855,20 @@
           <w:b/>
           <w:sz w:val="22"/>
         </w:rPr>
-        <w:t>Фрукти 100–150 г</w:t>
+        <w:t>Фрукты 100–150 г</w:t>
       </w:r>
       <w:r>
         <w:rPr>
           <w:rFonts w:ascii="Arial" w:hAnsi="Arial"/>
           <w:sz w:val="22"/>
         </w:rPr>
-        <w:t xml:space="preserve"> — джерело вітамінів і клітковини.</w:t>
+        <w:t xml:space="preserve"> — источник витаминов и клетчатки.</w:t>
       </w:r>
     </w:p>
     <w:p>
       <w:pPr>
-        <w:pStyle w:val="ListBullet"/>
         <w:spacing w:before="0" w:after="60"/>
+        <w:ind w:left="480"/>
       </w:pPr>
       <w:r>
         <w:rPr>
@@ -1880,7 +1876,7 @@
           <w:i/>
           <w:sz w:val="22"/>
         </w:rPr>
-        <w:t>Краще до 16:00. Акцент на цитрусові, ананаси, грейпфрути, різнокольорові.</w:t>
+        <w:t>Лучше до 16:00. Акцент на цитрусовые, ананасы, грейпфруты, разноцветные.</w:t>
       </w:r>
     </w:p>
     <w:p>
@@ -1893,9 +1889,8 @@
           <w:b/>
           <w:i w:val="0"/>
           <w:sz w:val="22"/>
-          <w:u w:val="none"/>
         </w:rPr>
-        <w:t>Білкові продукти:</w:t>
+        <w:t>Белковые продукты:</w:t>
       </w:r>
     </w:p>
     <w:p>
@@ -1909,20 +1904,20 @@
           <w:b/>
           <w:sz w:val="22"/>
         </w:rPr>
-        <w:t>Птиця та кролик (курка, індичка)</w:t>
+        <w:t>Птица и кролик (курица, индейка)</w:t>
       </w:r>
       <w:r>
         <w:rPr>
           <w:rFonts w:ascii="Arial" w:hAnsi="Arial"/>
           <w:sz w:val="22"/>
         </w:rPr>
-        <w:t xml:space="preserve"> — до 140–150 г за прийом, 3–4 рази на тиждень, бажано до 16:00.</w:t>
+        <w:t xml:space="preserve"> — до 140–150 г за приём, 3–4 раза в неделю, желательно до 16:00.</w:t>
       </w:r>
     </w:p>
     <w:p>
       <w:pPr>
-        <w:pStyle w:val="ListBullet"/>
         <w:spacing w:before="0" w:after="60"/>
+        <w:ind w:left="480"/>
       </w:pPr>
       <w:r>
         <w:rPr>
@@ -1930,7 +1925,7 @@
           <w:i/>
           <w:sz w:val="22"/>
         </w:rPr>
-        <w:t>Легко засвоюваний білок.</w:t>
+        <w:t>Легко усваиваемый белок.</w:t>
       </w:r>
     </w:p>
     <w:p>
@@ -1944,20 +1939,20 @@
           <w:b/>
           <w:sz w:val="22"/>
         </w:rPr>
-        <w:t>Нежирна телятина</w:t>
+        <w:t>Нежирная телятина</w:t>
       </w:r>
       <w:r>
         <w:rPr>
           <w:rFonts w:ascii="Arial" w:hAnsi="Arial"/>
           <w:sz w:val="22"/>
         </w:rPr>
-        <w:t xml:space="preserve"> — до 140 г, до 2 разів на тиждень.</w:t>
+        <w:t xml:space="preserve"> — до 140 г, до 2 раз в неделю.</w:t>
       </w:r>
     </w:p>
     <w:p>
       <w:pPr>
-        <w:pStyle w:val="ListBullet"/>
         <w:spacing w:before="0" w:after="60"/>
+        <w:ind w:left="480"/>
       </w:pPr>
       <w:r>
         <w:rPr>
@@ -1965,7 +1960,7 @@
           <w:i/>
           <w:sz w:val="22"/>
         </w:rPr>
-        <w:t>Джерело заліза та білка.</w:t>
+        <w:t>Источник железа и белка.</w:t>
       </w:r>
     </w:p>
     <w:p>
@@ -1979,20 +1974,20 @@
           <w:b/>
           <w:sz w:val="22"/>
         </w:rPr>
-        <w:t>Печінка (теляча, кролика, індички)</w:t>
+        <w:t>Печень (телячья, кроличья, индюшиная)</w:t>
       </w:r>
       <w:r>
         <w:rPr>
           <w:rFonts w:ascii="Arial" w:hAnsi="Arial"/>
           <w:sz w:val="22"/>
         </w:rPr>
-        <w:t xml:space="preserve"> — до 140 г, 1–2 рази на тиждень.</w:t>
+        <w:t xml:space="preserve"> — до 140 г, 1–2 раза в неделю.</w:t>
       </w:r>
     </w:p>
     <w:p>
       <w:pPr>
-        <w:pStyle w:val="ListBullet"/>
         <w:spacing w:before="0" w:after="60"/>
+        <w:ind w:left="480"/>
       </w:pPr>
       <w:r>
         <w:rPr>
@@ -2000,7 +1995,7 @@
           <w:i/>
           <w:sz w:val="22"/>
         </w:rPr>
-        <w:t>Багата на залізо та вітаміни групи B.</w:t>
+        <w:t>Богата железом и витаминами группы B.</w:t>
       </w:r>
     </w:p>
     <w:p>
@@ -2013,9 +2008,8 @@
           <w:b/>
           <w:i w:val="0"/>
           <w:sz w:val="22"/>
-          <w:u w:val="none"/>
         </w:rPr>
-        <w:t>Молочні продукти:</w:t>
+        <w:t>Молочные продукты:</w:t>
       </w:r>
     </w:p>
     <w:p>
@@ -2029,7 +2023,7 @@
           <w:b/>
           <w:sz w:val="22"/>
         </w:rPr>
-        <w:t>сир до 40% жирності</w:t>
+        <w:t>сыр до 40% жирности</w:t>
       </w:r>
     </w:p>
     <w:p>
@@ -2057,7 +2051,7 @@
           <w:b/>
           <w:sz w:val="22"/>
         </w:rPr>
-        <w:t>йогурт безлактозний, кефір</w:t>
+        <w:t>йогурт безлактозный, кефир</w:t>
       </w:r>
     </w:p>
     <w:p>
@@ -2071,7 +2065,7 @@
           <w:b/>
           <w:sz w:val="22"/>
         </w:rPr>
-        <w:t>вершкове масло 82%</w:t>
+        <w:t>сливочное масло 82%</w:t>
       </w:r>
     </w:p>
     <w:p>
@@ -2085,13 +2079,13 @@
           <w:b/>
           <w:sz w:val="22"/>
         </w:rPr>
-        <w:t>масло ГХІ</w:t>
+        <w:t>масло ГХИ</w:t>
       </w:r>
     </w:p>
     <w:p>
       <w:pPr>
-        <w:pStyle w:val="ListBullet"/>
         <w:spacing w:before="0" w:after="60"/>
+        <w:ind w:left="480"/>
       </w:pPr>
       <w:r>
         <w:rPr>
@@ -2099,7 +2093,7 @@
           <w:i/>
           <w:sz w:val="22"/>
         </w:rPr>
-        <w:t>Джерело корисних жирів і жиророзчинних вітамінів, а також покращує мікрофлору.</w:t>
+        <w:t>Источник полезных жиров и жирорастворимых витаминов, а также улучшает микрофлору.</w:t>
       </w:r>
     </w:p>
     <w:p>
@@ -2112,9 +2106,8 @@
           <w:b/>
           <w:i w:val="0"/>
           <w:sz w:val="22"/>
-          <w:u w:val="none"/>
         </w:rPr>
-        <w:t>Риба та морепродукти:</w:t>
+        <w:t>Рыба и морепродукты:</w:t>
       </w:r>
     </w:p>
     <w:p>
@@ -2128,14 +2121,14 @@
           <w:b/>
           <w:sz w:val="22"/>
         </w:rPr>
-        <w:t>Жирна риба 1–2 рази на тиждень</w:t>
+        <w:t>Жирная рыба 1–2 раза в неделю</w:t>
       </w:r>
       <w:r>
         <w:rPr>
           <w:rFonts w:ascii="Arial" w:hAnsi="Arial"/>
           <w:sz w:val="22"/>
         </w:rPr>
-        <w:t xml:space="preserve"> (лосось, скумбрія, оселедець) — джерело омега-3.</w:t>
+        <w:t xml:space="preserve"> (лосось, скумбрия, сельдь) — источник омега-3.</w:t>
       </w:r>
     </w:p>
     <w:p>
@@ -2149,14 +2142,14 @@
           <w:b/>
           <w:sz w:val="22"/>
         </w:rPr>
-        <w:t>Нежирна риба 4–5 разів на тиждень</w:t>
+        <w:t>Нежирная рыба 4–5 раз в неделю</w:t>
       </w:r>
       <w:r>
         <w:rPr>
           <w:rFonts w:ascii="Arial" w:hAnsi="Arial"/>
           <w:sz w:val="22"/>
         </w:rPr>
-        <w:t xml:space="preserve"> (тріска, хек, судак) — легко засвоюваний білок.</w:t>
+        <w:t xml:space="preserve"> (треска, хек, судак) — легко усваиваемый белок.</w:t>
       </w:r>
     </w:p>
     <w:p>
@@ -2170,14 +2163,14 @@
           <w:b/>
           <w:sz w:val="22"/>
         </w:rPr>
-        <w:t>Морепродукти 2–3 рази на тиждень</w:t>
+        <w:t>Морепродукты 2–3 раза в неделю</w:t>
       </w:r>
       <w:r>
         <w:rPr>
           <w:rFonts w:ascii="Arial" w:hAnsi="Arial"/>
           <w:sz w:val="22"/>
         </w:rPr>
-        <w:t xml:space="preserve"> — джерело йоду, білка та мікроелементів.</w:t>
+        <w:t xml:space="preserve"> — источник йода, белка и микроэлементов.</w:t>
       </w:r>
     </w:p>
     <w:p>
@@ -2190,9 +2183,8 @@
           <w:b/>
           <w:i w:val="0"/>
           <w:sz w:val="22"/>
-          <w:u w:val="none"/>
         </w:rPr>
-        <w:t>Додаткові продукти:</w:t>
+        <w:t>Дополнительные продукты:</w:t>
       </w:r>
     </w:p>
     <w:p>
@@ -2206,20 +2198,20 @@
           <w:b/>
           <w:sz w:val="22"/>
         </w:rPr>
-        <w:t>Бобові (квасоля, сочевиця, нут, соя)</w:t>
+        <w:t>Бобовые (фасоль, чечевица, нут, соя)</w:t>
       </w:r>
       <w:r>
         <w:rPr>
           <w:rFonts w:ascii="Arial" w:hAnsi="Arial"/>
           <w:sz w:val="22"/>
         </w:rPr>
-        <w:t xml:space="preserve"> — 100–130 г, 2–4 рази на тиждень.</w:t>
+        <w:t xml:space="preserve"> — 100–130 г, 2–4 раза в неделю.</w:t>
       </w:r>
     </w:p>
     <w:p>
       <w:pPr>
-        <w:pStyle w:val="ListBullet"/>
         <w:spacing w:before="0" w:after="60"/>
+        <w:ind w:left="480"/>
       </w:pPr>
       <w:r>
         <w:rPr>
@@ -2227,7 +2219,7 @@
           <w:i/>
           <w:sz w:val="22"/>
         </w:rPr>
-        <w:t>Джерело рослинного білка та клітковини.</w:t>
+        <w:t>Источник растительного белка и клетчатки.</w:t>
       </w:r>
     </w:p>
     <w:p>
@@ -2241,20 +2233,20 @@
           <w:b/>
           <w:sz w:val="22"/>
         </w:rPr>
-        <w:t>Гриби до 100 г</w:t>
+        <w:t>Грибы до 100 г</w:t>
       </w:r>
       <w:r>
         <w:rPr>
           <w:rFonts w:ascii="Arial" w:hAnsi="Arial"/>
           <w:sz w:val="22"/>
         </w:rPr>
-        <w:t xml:space="preserve"> — 1–2 рази на тиждень до 16:00.</w:t>
+        <w:t xml:space="preserve"> — 1–2 раза в неделю до 16:00.</w:t>
       </w:r>
     </w:p>
     <w:p>
       <w:pPr>
-        <w:pStyle w:val="ListBullet"/>
         <w:spacing w:before="0" w:after="60"/>
+        <w:ind w:left="480"/>
       </w:pPr>
       <w:r>
         <w:rPr>
@@ -2262,7 +2254,7 @@
           <w:i/>
           <w:sz w:val="22"/>
         </w:rPr>
-        <w:t>Містять білок, клітковину і мікроелементи.</w:t>
+        <w:t>Содержат белок, клетчатку и микроэлементы.</w:t>
       </w:r>
     </w:p>
     <w:p>
@@ -2276,20 +2268,20 @@
           <w:b/>
           <w:sz w:val="22"/>
         </w:rPr>
-        <w:t>Крупи 3–4 ст. л</w:t>
+        <w:t>Крупы 3–4 ст. л</w:t>
       </w:r>
       <w:r>
         <w:rPr>
           <w:rFonts w:ascii="Arial" w:hAnsi="Arial"/>
           <w:sz w:val="22"/>
         </w:rPr>
-        <w:t xml:space="preserve"> — 4–5 разів на тиждень, краще вранці або в обід.</w:t>
+        <w:t xml:space="preserve"> — 4–5 раз в неделю, лучше утром или в обед.</w:t>
       </w:r>
     </w:p>
     <w:p>
       <w:pPr>
-        <w:pStyle w:val="ListBullet"/>
         <w:spacing w:before="0" w:after="60"/>
+        <w:ind w:left="480"/>
       </w:pPr>
       <w:r>
         <w:rPr>
@@ -2297,12 +2289,12 @@
           <w:i/>
           <w:sz w:val="22"/>
         </w:rPr>
-        <w:t>Підходять: гречка, бурий/дикий рис, кіноа, пшоно, сорго.</w:t>
+        <w:t>Подходят: гречка, бурый/дикий рис, киноа, пшено, сорго.</w:t>
       </w:r>
     </w:p>
     <w:p>
       <w:pPr>
-        <w:spacing w:before="40" w:after="40"/>
+        <w:spacing w:before="80" w:after="80"/>
         <w:pBdr>
           <w:bottom w:val="single" w:sz="4" w:space="1" w:color="AAAAAA"/>
         </w:pBdr>
@@ -2310,7 +2302,7 @@
     </w:p>
     <w:p>
       <w:pPr>
-        <w:spacing w:before="160" w:after="80"/>
+        <w:spacing w:before="200" w:after="80"/>
       </w:pPr>
       <w:r>
         <w:rPr>
@@ -2333,9 +2325,8 @@
           <w:b/>
           <w:i w:val="0"/>
           <w:sz w:val="22"/>
-          <w:u w:val="none"/>
         </w:rPr>
-        <w:t>Сніданки:</w:t>
+        <w:t>Завтраки:</w:t>
       </w:r>
     </w:p>
     <w:p>
@@ -2349,7 +2340,7 @@
           <w:b/>
           <w:sz w:val="22"/>
         </w:rPr>
-        <w:t>Тост із чорного хліба з тунцем + гречка + вершкове масло</w:t>
+        <w:t>Тост из чёрного хлеба с тунцом + гречка + сливочное масло</w:t>
       </w:r>
     </w:p>
     <w:p>
@@ -2363,7 +2354,7 @@
           <w:b/>
           <w:sz w:val="22"/>
         </w:rPr>
-        <w:t>Омлет із 2 яєць + пшоно + тушкована морква</w:t>
+        <w:t>Омлет из 2 яиц + пшено + тушёная морковь</w:t>
       </w:r>
     </w:p>
     <w:p>
@@ -2377,7 +2368,7 @@
           <w:b/>
           <w:sz w:val="22"/>
         </w:rPr>
-        <w:t>2 яйця пашот + кіноа + зелень</w:t>
+        <w:t>2 яйца пашот + киноа + зелень</w:t>
       </w:r>
     </w:p>
     <w:p>
@@ -2391,7 +2382,7 @@
           <w:b/>
           <w:sz w:val="22"/>
         </w:rPr>
-        <w:t>Тост із цільнозернового хліба + хумус + тушкований буряк</w:t>
+        <w:t>Тост из цельнозернового хлеба + хумус + тушёная свёкла</w:t>
       </w:r>
     </w:p>
     <w:p>
@@ -2405,7 +2396,7 @@
           <w:b/>
           <w:sz w:val="22"/>
         </w:rPr>
-        <w:t>Омлет + бурий рис + масло ГХІ</w:t>
+        <w:t>Омлет + бурый рис + масло ГХИ</w:t>
       </w:r>
     </w:p>
     <w:p>
@@ -2419,7 +2410,7 @@
           <w:b/>
           <w:sz w:val="22"/>
         </w:rPr>
-        <w:t>Яйця некруто + гречка + огірок</w:t>
+        <w:t>Яйца всмятку + гречка + огурец</w:t>
       </w:r>
     </w:p>
     <w:p>
@@ -2433,7 +2424,7 @@
           <w:b/>
           <w:sz w:val="22"/>
         </w:rPr>
-        <w:t>Авокадо + гречка + тушкована капуста</w:t>
+        <w:t>Авокадо + гречка + тушёная капуста</w:t>
       </w:r>
     </w:p>
     <w:p>
@@ -2447,7 +2438,7 @@
           <w:b/>
           <w:sz w:val="22"/>
         </w:rPr>
-        <w:t>Пшоняна каша з гарбузом</w:t>
+        <w:t>Пшённая каша с тыквой</w:t>
       </w:r>
     </w:p>
     <w:p>
@@ -2461,7 +2452,7 @@
           <w:b/>
           <w:sz w:val="22"/>
         </w:rPr>
-        <w:t>Картопля в мундирі + салат + слабосолена риба</w:t>
+        <w:t>Картофель в мундире + салат + слабосолёная рыба</w:t>
       </w:r>
     </w:p>
     <w:p>
@@ -2475,7 +2466,7 @@
           <w:b/>
           <w:sz w:val="22"/>
         </w:rPr>
-        <w:t>Гречка з грибами + квашена капуста</w:t>
+        <w:t>Гречка с грибами + квашеная капуста</w:t>
       </w:r>
     </w:p>
     <w:p>
@@ -2489,7 +2480,7 @@
           <w:b/>
           <w:sz w:val="22"/>
         </w:rPr>
-        <w:t>Кабачково-морквяні оладки + сметана + моцарела</w:t>
+        <w:t>Кабачково-морковные оладьи + сметана + моцарелла</w:t>
       </w:r>
     </w:p>
     <w:p>
@@ -2503,7 +2494,7 @@
           <w:b/>
           <w:sz w:val="22"/>
         </w:rPr>
-        <w:t>Омлет з овочами + бурий рис</w:t>
+        <w:t>Омлет с овощами + бурый рис</w:t>
       </w:r>
     </w:p>
     <w:p>
@@ -2516,9 +2507,8 @@
           <w:b/>
           <w:i w:val="0"/>
           <w:sz w:val="22"/>
-          <w:u w:val="none"/>
         </w:rPr>
-        <w:t>Перекуси:</w:t>
+        <w:t>Перекусы:</w:t>
       </w:r>
     </w:p>
     <w:p>
@@ -2532,7 +2522,7 @@
           <w:b/>
           <w:sz w:val="22"/>
         </w:rPr>
-        <w:t>Яблуко + сир</w:t>
+        <w:t>Яблоко + сыр</w:t>
       </w:r>
     </w:p>
     <w:p>
@@ -2546,7 +2536,7 @@
           <w:b/>
           <w:sz w:val="22"/>
         </w:rPr>
-        <w:t>Ягоди + сметана</w:t>
+        <w:t>Ягоды + сметана</w:t>
       </w:r>
     </w:p>
     <w:p>
@@ -2574,7 +2564,7 @@
           <w:b/>
           <w:sz w:val="22"/>
         </w:rPr>
-        <w:t>Грейпфрут + насіння</w:t>
+        <w:t>Грейпфрут + семена</w:t>
       </w:r>
     </w:p>
     <w:p>
@@ -2588,7 +2578,7 @@
           <w:b/>
           <w:sz w:val="22"/>
         </w:rPr>
-        <w:t>Йогурт + ягоди</w:t>
+        <w:t>Йогурт + ягоды</w:t>
       </w:r>
     </w:p>
     <w:p>
@@ -2602,7 +2592,7 @@
           <w:b/>
           <w:sz w:val="22"/>
         </w:rPr>
-        <w:t>Запечене яблуко</w:t>
+        <w:t>Запечённое яблоко</w:t>
       </w:r>
     </w:p>
     <w:p>
@@ -2616,7 +2606,7 @@
           <w:b/>
           <w:sz w:val="22"/>
         </w:rPr>
-        <w:t>Сир брі + груша</w:t>
+        <w:t>Сыр бри + груша</w:t>
       </w:r>
     </w:p>
     <w:p>
@@ -2630,7 +2620,7 @@
           <w:b/>
           <w:sz w:val="22"/>
         </w:rPr>
-        <w:t>Ананас або ківі</w:t>
+        <w:t>Ананас или киви</w:t>
       </w:r>
     </w:p>
     <w:p>
@@ -2643,9 +2633,8 @@
           <w:b/>
           <w:i w:val="0"/>
           <w:sz w:val="22"/>
-          <w:u w:val="none"/>
         </w:rPr>
-        <w:t>Обіди:</w:t>
+        <w:t>Обеды:</w:t>
       </w:r>
     </w:p>
     <w:p>
@@ -2659,7 +2648,7 @@
           <w:b/>
           <w:sz w:val="22"/>
         </w:rPr>
-        <w:t>Куряче філе + гречка + салат</w:t>
+        <w:t>Куриное филе + гречка + салат</w:t>
       </w:r>
     </w:p>
     <w:p>
@@ -2673,7 +2662,7 @@
           <w:b/>
           <w:sz w:val="22"/>
         </w:rPr>
-        <w:t>Індичка + пшоно</w:t>
+        <w:t>Индейка + пшено</w:t>
       </w:r>
     </w:p>
     <w:p>
@@ -2687,7 +2676,7 @@
           <w:b/>
           <w:sz w:val="22"/>
         </w:rPr>
-        <w:t>Телятина + картопля + зелень</w:t>
+        <w:t>Телятина + картофель + зелень</w:t>
       </w:r>
     </w:p>
     <w:p>
@@ -2701,7 +2690,7 @@
           <w:b/>
           <w:sz w:val="22"/>
         </w:rPr>
-        <w:t>Печінка індички + гречка</w:t>
+        <w:t>Печень индейки + гречка</w:t>
       </w:r>
     </w:p>
     <w:p>
@@ -2715,7 +2704,7 @@
           <w:b/>
           <w:sz w:val="22"/>
         </w:rPr>
-        <w:t>Курка + бурий рис + салат</w:t>
+        <w:t>Курица + бурый рис + салат</w:t>
       </w:r>
     </w:p>
     <w:p>
@@ -2729,7 +2718,7 @@
           <w:b/>
           <w:sz w:val="22"/>
         </w:rPr>
-        <w:t>Квасоля + овочі</w:t>
+        <w:t>Фасоль + овощи</w:t>
       </w:r>
     </w:p>
     <w:p>
@@ -2743,7 +2732,7 @@
           <w:b/>
           <w:sz w:val="22"/>
         </w:rPr>
-        <w:t>Сочевиця + капуста</w:t>
+        <w:t>Чечевица + капуста</w:t>
       </w:r>
     </w:p>
     <w:p>
@@ -2757,7 +2746,7 @@
           <w:b/>
           <w:sz w:val="22"/>
         </w:rPr>
-        <w:t>Риба + картопля + салат</w:t>
+        <w:t>Рыба + картофель + салат</w:t>
       </w:r>
     </w:p>
     <w:p>
@@ -2771,7 +2760,7 @@
           <w:b/>
           <w:sz w:val="22"/>
         </w:rPr>
-        <w:t>Тефтелі + пюре з цвітної капусти</w:t>
+        <w:t>Тефтели + пюре из цветной капусты</w:t>
       </w:r>
     </w:p>
     <w:p>
@@ -2785,7 +2774,7 @@
           <w:b/>
           <w:sz w:val="22"/>
         </w:rPr>
-        <w:t>Борщ + хліб</w:t>
+        <w:t>Борщ + хлеб</w:t>
       </w:r>
     </w:p>
     <w:p>
@@ -2799,7 +2788,7 @@
           <w:b/>
           <w:sz w:val="22"/>
         </w:rPr>
-        <w:t>Скумбрія з овочами (або філе риби запечене)</w:t>
+        <w:t>Скумбрия с овощами (или филе рыбы запечённое)</w:t>
       </w:r>
     </w:p>
     <w:p>
@@ -2813,7 +2802,7 @@
           <w:b/>
           <w:sz w:val="22"/>
         </w:rPr>
-        <w:t>Голубці</w:t>
+        <w:t>Голубцы</w:t>
       </w:r>
     </w:p>
     <w:p>
@@ -2827,7 +2816,7 @@
           <w:b/>
           <w:sz w:val="22"/>
         </w:rPr>
-        <w:t>Суші 6–8 шт</w:t>
+        <w:t>Суши 6–8 шт</w:t>
       </w:r>
     </w:p>
     <w:p>
@@ -2841,7 +2830,7 @@
           <w:b/>
           <w:sz w:val="22"/>
         </w:rPr>
-        <w:t>Суп з куркою + 1 шматочок цільнозернового хліба або 2 хлібці</w:t>
+        <w:t>Суп с курицей + 1 кусочек цельнозернового хлеба или 2 хлебца</w:t>
       </w:r>
     </w:p>
     <w:p>
@@ -2855,7 +2844,7 @@
           <w:b/>
           <w:sz w:val="22"/>
         </w:rPr>
-        <w:t>Лаваш з куркою і овочами з грецьким йогуртом</w:t>
+        <w:t>Лаваш с курицей и овощами с греческим йогуртом</w:t>
       </w:r>
     </w:p>
     <w:p>
@@ -2869,7 +2858,7 @@
           <w:b/>
           <w:sz w:val="22"/>
         </w:rPr>
-        <w:t>Салат з морепродуктами</w:t>
+        <w:t>Салат с морепродуктами</w:t>
       </w:r>
     </w:p>
     <w:p>
@@ -2882,9 +2871,8 @@
           <w:b/>
           <w:i w:val="0"/>
           <w:sz w:val="22"/>
-          <w:u w:val="none"/>
         </w:rPr>
-        <w:t>Полуденок:</w:t>
+        <w:t>Полдник:</w:t>
       </w:r>
     </w:p>
     <w:p>
@@ -2898,7 +2886,7 @@
           <w:b/>
           <w:sz w:val="22"/>
         </w:rPr>
-        <w:t>Сир фета + овочі</w:t>
+        <w:t>Сыр фета + овощи</w:t>
       </w:r>
     </w:p>
     <w:p>
@@ -2912,7 +2900,7 @@
           <w:b/>
           <w:sz w:val="22"/>
         </w:rPr>
-        <w:t>Ягоди до 120 г</w:t>
+        <w:t>Ягоды до 120 г</w:t>
       </w:r>
     </w:p>
     <w:p>
@@ -2926,7 +2914,7 @@
           <w:b/>
           <w:sz w:val="22"/>
         </w:rPr>
-        <w:t>Яблуко</w:t>
+        <w:t>Яблоко</w:t>
       </w:r>
     </w:p>
     <w:p>
@@ -2940,7 +2928,7 @@
           <w:b/>
           <w:sz w:val="22"/>
         </w:rPr>
-        <w:t>Запечена груша</w:t>
+        <w:t>Запечённая груша</w:t>
       </w:r>
     </w:p>
     <w:p>
@@ -2954,7 +2942,7 @@
           <w:b/>
           <w:sz w:val="22"/>
         </w:rPr>
-        <w:t>Хумус + хлібець</w:t>
+        <w:t>Хумус + хлебец</w:t>
       </w:r>
     </w:p>
     <w:p>
@@ -2968,7 +2956,7 @@
           <w:b/>
           <w:sz w:val="22"/>
         </w:rPr>
-        <w:t>Фрукти до 100 г</w:t>
+        <w:t>Фрукты до 100 г</w:t>
       </w:r>
     </w:p>
     <w:p>
@@ -2981,9 +2969,8 @@
           <w:b/>
           <w:i w:val="0"/>
           <w:sz w:val="22"/>
-          <w:u w:val="none"/>
         </w:rPr>
-        <w:t>Вечері:</w:t>
+        <w:t>Ужины:</w:t>
       </w:r>
     </w:p>
     <w:p>
@@ -2997,7 +2984,7 @@
           <w:b/>
           <w:sz w:val="22"/>
         </w:rPr>
-        <w:t>Тріска + овочі</w:t>
+        <w:t>Треска + овощи</w:t>
       </w:r>
     </w:p>
     <w:p>
@@ -3039,7 +3026,7 @@
           <w:b/>
           <w:sz w:val="22"/>
         </w:rPr>
-        <w:t>Риба + буряк</w:t>
+        <w:t>Рыба + свёкла</w:t>
       </w:r>
     </w:p>
     <w:p>
@@ -3053,7 +3040,7 @@
           <w:b/>
           <w:sz w:val="22"/>
         </w:rPr>
-        <w:t>Морепродукти + рагу</w:t>
+        <w:t>Морепродукты + рагу</w:t>
       </w:r>
     </w:p>
     <w:p>
@@ -3067,7 +3054,7 @@
           <w:b/>
           <w:sz w:val="22"/>
         </w:rPr>
-        <w:t>Борщ з квасолею</w:t>
+        <w:t>Борщ с фасолью</w:t>
       </w:r>
     </w:p>
     <w:p>
@@ -3081,7 +3068,7 @@
           <w:b/>
           <w:sz w:val="22"/>
         </w:rPr>
-        <w:t>Рибні котлети + овочі</w:t>
+        <w:t>Рыбные котлеты + овощи</w:t>
       </w:r>
     </w:p>
     <w:p>
@@ -3095,7 +3082,7 @@
           <w:b/>
           <w:sz w:val="22"/>
         </w:rPr>
-        <w:t>Суп з фрикадельками</w:t>
+        <w:t>Суп с фрикадельками</w:t>
       </w:r>
     </w:p>
     <w:p>
@@ -3109,7 +3096,7 @@
           <w:b/>
           <w:sz w:val="22"/>
         </w:rPr>
-        <w:t>Крем-суп зі шпинату</w:t>
+        <w:t>Крем-суп из шпината</w:t>
       </w:r>
     </w:p>
     <w:p>
@@ -3123,7 +3110,7 @@
           <w:b/>
           <w:sz w:val="22"/>
         </w:rPr>
-        <w:t>Овочеве рагу з куркою</w:t>
+        <w:t>Овощное рагу с курицей</w:t>
       </w:r>
     </w:p>
     <w:p>
@@ -3137,7 +3124,7 @@
           <w:b/>
           <w:sz w:val="22"/>
         </w:rPr>
-        <w:t>Грецький салат</w:t>
+        <w:t>Греческий салат</w:t>
       </w:r>
     </w:p>
     <w:p>
@@ -3151,7 +3138,7 @@
           <w:b/>
           <w:sz w:val="22"/>
         </w:rPr>
-        <w:t>Вінегрет + сир фета 2/1</w:t>
+        <w:t>Винегрет + сыр фета 2/1</w:t>
       </w:r>
     </w:p>
     <w:p>
@@ -3165,12 +3152,12 @@
           <w:b/>
           <w:sz w:val="22"/>
         </w:rPr>
-        <w:t>Лосось + броколі або цвітна капуста на пару</w:t>
+        <w:t>Лосось + брокколи или цветная капуста на пару</w:t>
       </w:r>
     </w:p>
     <w:p>
       <w:pPr>
-        <w:spacing w:before="40" w:after="40"/>
+        <w:spacing w:before="80" w:after="80"/>
         <w:pBdr>
           <w:bottom w:val="single" w:sz="4" w:space="1" w:color="AAAAAA"/>
         </w:pBdr>
@@ -3178,7 +3165,7 @@
     </w:p>
     <w:p>
       <w:pPr>
-        <w:spacing w:before="160" w:after="80"/>
+        <w:spacing w:before="200" w:after="80"/>
       </w:pPr>
       <w:r>
         <w:rPr>
@@ -3188,7 +3175,7 @@
           <w:sz w:val="22"/>
           <w:shd w:val="clear" w:color="auto" w:fill="A8D08D"/>
         </w:rPr>
-        <w:t>Схема корекції здоров'я:</w:t>
+        <w:t>Схема коррекции здоровья:</w:t>
       </w:r>
     </w:p>
     <w:p>
@@ -3202,14 +3189,14 @@
           <w:b/>
           <w:sz w:val="22"/>
         </w:rPr>
-        <w:t xml:space="preserve">Хітозан — </w:t>
+        <w:t xml:space="preserve">Хитозан — </w:t>
       </w:r>
       <w:r>
         <w:rPr>
           <w:rFonts w:ascii="Arial" w:hAnsi="Arial"/>
           <w:sz w:val="22"/>
         </w:rPr>
-        <w:t>по 2 к перед сном і 2 капсули натщесерце — 10 днів. Після по 1 к перед сном і зранку натщесерце.</w:t>
+        <w:t>по 2 к перед сном и 2 капсулы натощак — 10 дней. После по 1 к перед сном и утром натощак.</w:t>
       </w:r>
     </w:p>
     <w:p>
@@ -3223,14 +3210,14 @@
           <w:b/>
           <w:sz w:val="22"/>
         </w:rPr>
-        <w:t xml:space="preserve">Бісгліцинат магнію — </w:t>
+        <w:t xml:space="preserve">Бисглицинат магния — </w:t>
       </w:r>
       <w:r>
         <w:rPr>
           <w:rFonts w:ascii="Arial" w:hAnsi="Arial"/>
           <w:sz w:val="22"/>
         </w:rPr>
-        <w:t>по 500 мг зранку і перед сном — 20 днів. Після по 500 мг перед сном довгостроково.</w:t>
+        <w:t>по 500 мг утром и перед сном — 20 дней. После по 500 мг перед сном долгосрочно.</w:t>
       </w:r>
     </w:p>
     <w:p>
@@ -3244,14 +3231,14 @@
           <w:b/>
           <w:sz w:val="22"/>
         </w:rPr>
-        <w:t xml:space="preserve">Вітамін Д — </w:t>
+        <w:t xml:space="preserve">Витамин Д — </w:t>
       </w:r>
       <w:r>
         <w:rPr>
           <w:rFonts w:ascii="Arial" w:hAnsi="Arial"/>
           <w:sz w:val="22"/>
         </w:rPr>
-        <w:t>по 4000 од — 2 тижні. Після по 2000 од. до червня включно.</w:t>
+        <w:t>по 4000 ед — 2 недели. После по 2000 ед. до июня включительно.</w:t>
       </w:r>
     </w:p>
     <w:p>
@@ -3272,7 +3259,7 @@
           <w:rFonts w:ascii="Arial" w:hAnsi="Arial"/>
           <w:sz w:val="22"/>
         </w:rPr>
-        <w:t>по 50 мг 2 рази в день. Курс 1 місяць.</w:t>
+        <w:t>по 50 мг 2 раза в день. Курс 1 месяц.</w:t>
       </w:r>
     </w:p>
     <w:p>
@@ -3293,7 +3280,7 @@
           <w:rFonts w:ascii="Arial" w:hAnsi="Arial"/>
           <w:sz w:val="22"/>
         </w:rPr>
-        <w:t>(по рекомендації виробника) — курс 3 місяці. (допомагає відновленню наднирників, допомагає адаптуватись до стресу)</w:t>
+        <w:t>(по рекомендации производителя) — курс 3 месяца. (помогает восстановлению надпочечников, помогает адаптироваться к стрессу)</w:t>
       </w:r>
     </w:p>
     <w:p>
@@ -3314,7 +3301,7 @@
           <w:rFonts w:ascii="Arial" w:hAnsi="Arial"/>
           <w:sz w:val="22"/>
         </w:rPr>
-        <w:t>по 1 к 2 рази в день і ввечері о 21–22:00 — 2 тижні, потім по 2 к 2 рази на день — 2,5 місяця.</w:t>
+        <w:t>по 1 к 2 раза в день и вечером в 21–22:00 — 2 недели, затем по 2 к 2 раза в день — 2,5 месяца.</w:t>
       </w:r>
     </w:p>
     <w:p>
@@ -3335,7 +3322,7 @@
           <w:rFonts w:ascii="Arial" w:hAnsi="Arial"/>
           <w:sz w:val="22"/>
         </w:rPr>
-        <w:t>по 1 к 2 рази на день з їжею. Курс від 3 місяців. (для зменшення запалення в суглобах і відновлення руху та хрящів)</w:t>
+        <w:t>по 1 к 2 раза в день с едой. Курс от 3 месяцев. (для уменьшения воспаления в суставах и восстановления движения и хрящей)</w:t>
       </w:r>
     </w:p>
     <w:p>
@@ -3349,14 +3336,14 @@
           <w:b/>
           <w:sz w:val="22"/>
         </w:rPr>
-        <w:t xml:space="preserve">L-аргінін — </w:t>
+        <w:t xml:space="preserve">L-аргинин — </w:t>
       </w:r>
       <w:r>
         <w:rPr>
           <w:rFonts w:ascii="Arial" w:hAnsi="Arial"/>
           <w:sz w:val="22"/>
         </w:rPr>
-        <w:t>по 1000 мг зранку з їжею. Курс 3 місяці (для покращення кровообігу і зниження тиску).</w:t>
+        <w:t>по 1000 мг утром с едой. Курс 3 месяца (для улучшения кровообращения и снижения давления).</w:t>
       </w:r>
     </w:p>
     <w:p>
@@ -3377,12 +3364,12 @@
           <w:rFonts w:ascii="Arial" w:hAnsi="Arial"/>
           <w:sz w:val="22"/>
         </w:rPr>
-        <w:t>по 1 к зранку і перед сном. Курс 1 місяць (антистрес).</w:t>
+        <w:t>по 1 к утром и перед сном. Курс 1 месяц (антистресс).</w:t>
       </w:r>
     </w:p>
     <w:p>
       <w:pPr>
-        <w:spacing w:before="40" w:after="40"/>
+        <w:spacing w:before="80" w:after="80"/>
         <w:pBdr>
           <w:bottom w:val="single" w:sz="4" w:space="1" w:color="AAAAAA"/>
         </w:pBdr>
@@ -3404,7 +3391,7 @@
           <w:color w:val="2E74B5"/>
           <w:sz w:val="22"/>
         </w:rPr>
-        <w:t>Вітаю! / Поздравляю!</w:t>
+        <w:t>Поздравляю!</w:t>
       </w:r>
     </w:p>
     <w:p>
@@ -3418,7 +3405,7 @@
           <w:color w:val="2E74B5"/>
           <w:sz w:val="22"/>
         </w:rPr>
-        <w:t>Дякую за довіру. / Благодарю за доверие.</w:t>
+        <w:t>Благодарю за доверие.</w:t>
       </w:r>
     </w:p>
     <w:p>
@@ -3445,7 +3432,7 @@
           <w:color w:val="2E74B5"/>
           <w:sz w:val="22"/>
         </w:rPr>
-        <w:t>Я рада вітати Вас на Вашій програмі корекції ваги та здоров'я.</w:t>
+        <w:t>Я рада приветствовать Вас на Вашей программе коррекции веса и здоровья.</w:t>
       </w:r>
     </w:p>
     <w:p>
@@ -3472,7 +3459,7 @@
           <w:color w:val="2E74B5"/>
           <w:sz w:val="22"/>
         </w:rPr>
-        <w:t>Моя ціль допомогти вам впоратись з вашою проблемою та навчитись свідомо керувати своїм здоров'ям.</w:t>
+        <w:t>Моя цель — помочь Вам справиться с Вашей проблемой и научиться осознанно управлять своим здоровьем.</w:t>
       </w:r>
     </w:p>
     <w:p>
@@ -3499,7 +3486,7 @@
           <w:color w:val="2E74B5"/>
           <w:sz w:val="22"/>
         </w:rPr>
-        <w:t>З турботою і вірою у Вас, ваш Health-coach Anna Soloviova та команда проєкту WELLNESS CODE by Anna Soloviova</w:t>
+        <w:t>С заботой и верой в Вас, ваш Health-coach Anna Soloviova и команда проекта WELLNESS CODE by Anna Soloviova</w:t>
       </w:r>
     </w:p>
     <w:sectPr>

</xml_diff>

<commit_message>
Update Lobel Ilana document with revised supplements scheme
https://claude.ai/code/session_01RmPX2FnwAMhZJTsjLdH3st
</commit_message>
<xml_diff>
--- a/Lobel_Ilana_FULL.docx
+++ b/Lobel_Ilana_FULL.docx
@@ -3231,6 +3231,27 @@
           <w:b/>
           <w:sz w:val="22"/>
         </w:rPr>
+        <w:t xml:space="preserve">Калий цитрат — </w:t>
+      </w:r>
+      <w:r>
+        <w:rPr>
+          <w:rFonts w:ascii="Arial" w:hAnsi="Arial"/>
+          <w:sz w:val="22"/>
+        </w:rPr>
+        <w:t>по 500 мг утром и в обед с едой — 15 дней, после по 500 мг утром. Длительно.</w:t>
+      </w:r>
+    </w:p>
+    <w:p>
+      <w:pPr>
+        <w:pStyle w:val="ListBullet"/>
+        <w:spacing w:before="0" w:after="60"/>
+      </w:pPr>
+      <w:r>
+        <w:rPr>
+          <w:rFonts w:ascii="Arial" w:hAnsi="Arial"/>
+          <w:b/>
+          <w:sz w:val="22"/>
+        </w:rPr>
         <w:t xml:space="preserve">Витамин Д — </w:t>
       </w:r>
       <w:r>
@@ -3294,48 +3315,6 @@
           <w:b/>
           <w:sz w:val="22"/>
         </w:rPr>
-        <w:t xml:space="preserve">Phithorin — </w:t>
-      </w:r>
-      <w:r>
-        <w:rPr>
-          <w:rFonts w:ascii="Arial" w:hAnsi="Arial"/>
-          <w:sz w:val="22"/>
-        </w:rPr>
-        <w:t>по 1 к 2 раза в день и вечером в 21–22:00 — 2 недели, затем по 2 к 2 раза в день — 2,5 месяца.</w:t>
-      </w:r>
-    </w:p>
-    <w:p>
-      <w:pPr>
-        <w:pStyle w:val="ListBullet"/>
-        <w:spacing w:before="0" w:after="60"/>
-      </w:pPr>
-      <w:r>
-        <w:rPr>
-          <w:rFonts w:ascii="Arial" w:hAnsi="Arial"/>
-          <w:b/>
-          <w:sz w:val="22"/>
-        </w:rPr>
-        <w:t xml:space="preserve">МУВ Форевер — </w:t>
-      </w:r>
-      <w:r>
-        <w:rPr>
-          <w:rFonts w:ascii="Arial" w:hAnsi="Arial"/>
-          <w:sz w:val="22"/>
-        </w:rPr>
-        <w:t>по 1 к 2 раза в день с едой. Курс от 3 месяцев. (для уменьшения воспаления в суставах и восстановления движения и хрящей)</w:t>
-      </w:r>
-    </w:p>
-    <w:p>
-      <w:pPr>
-        <w:pStyle w:val="ListBullet"/>
-        <w:spacing w:before="0" w:after="60"/>
-      </w:pPr>
-      <w:r>
-        <w:rPr>
-          <w:rFonts w:ascii="Arial" w:hAnsi="Arial"/>
-          <w:b/>
-          <w:sz w:val="22"/>
-        </w:rPr>
         <w:t xml:space="preserve">L-аргинин — </w:t>
       </w:r>
       <w:r>
@@ -3344,6 +3323,27 @@
           <w:sz w:val="22"/>
         </w:rPr>
         <w:t>по 1000 мг утром с едой. Курс 3 месяца (для улучшения кровообращения и снижения давления).</w:t>
+      </w:r>
+    </w:p>
+    <w:p>
+      <w:pPr>
+        <w:pStyle w:val="ListBullet"/>
+        <w:spacing w:before="0" w:after="60"/>
+      </w:pPr>
+      <w:r>
+        <w:rPr>
+          <w:rFonts w:ascii="Arial" w:hAnsi="Arial"/>
+          <w:b/>
+          <w:sz w:val="22"/>
+        </w:rPr>
+        <w:t xml:space="preserve">Ношение коррекционных стелек — </w:t>
+      </w:r>
+      <w:r>
+        <w:rPr>
+          <w:rFonts w:ascii="Arial" w:hAnsi="Arial"/>
+          <w:sz w:val="22"/>
+        </w:rPr>
+        <w:t>начиная с 20 минут в день, постепенно добавляя время.</w:t>
       </w:r>
     </w:p>
     <w:p>
@@ -3365,6 +3365,90 @@
           <w:sz w:val="22"/>
         </w:rPr>
         <w:t>по 1 к утром и перед сном. Курс 1 месяц (антистресс).</w:t>
+      </w:r>
+    </w:p>
+    <w:p>
+      <w:pPr>
+        <w:pStyle w:val="ListBullet"/>
+        <w:spacing w:before="0" w:after="60"/>
+      </w:pPr>
+      <w:r>
+        <w:rPr>
+          <w:rFonts w:ascii="Arial" w:hAnsi="Arial"/>
+          <w:b/>
+          <w:sz w:val="22"/>
+        </w:rPr>
+        <w:t xml:space="preserve">Линджи — </w:t>
+      </w:r>
+      <w:r>
+        <w:rPr>
+          <w:rFonts w:ascii="Arial" w:hAnsi="Arial"/>
+          <w:sz w:val="22"/>
+        </w:rPr>
+        <w:t>по 1 к 2 раза в день. Курс 2 месяца.</w:t>
+      </w:r>
+    </w:p>
+    <w:p>
+      <w:pPr>
+        <w:pStyle w:val="ListBullet"/>
+        <w:spacing w:before="0" w:after="60"/>
+      </w:pPr>
+      <w:r>
+        <w:rPr>
+          <w:rFonts w:ascii="Arial" w:hAnsi="Arial"/>
+          <w:b/>
+          <w:sz w:val="22"/>
+        </w:rPr>
+        <w:t xml:space="preserve">Лецитин подсолнечниковый — </w:t>
+      </w:r>
+      <w:r>
+        <w:rPr>
+          <w:rFonts w:ascii="Arial" w:hAnsi="Arial"/>
+          <w:sz w:val="22"/>
+        </w:rPr>
+        <w:t>по 5 г с едой. Курс 3 месяца.</w:t>
+      </w:r>
+    </w:p>
+    <w:p>
+      <w:pPr>
+        <w:pStyle w:val="ListBullet"/>
+        <w:spacing w:before="0" w:after="60"/>
+      </w:pPr>
+      <w:r>
+        <w:rPr>
+          <w:rFonts w:ascii="Arial" w:hAnsi="Arial"/>
+          <w:b/>
+          <w:sz w:val="22"/>
+        </w:rPr>
+        <w:t xml:space="preserve">Омега 3 — </w:t>
+      </w:r>
+      <w:r>
+        <w:rPr>
+          <w:rFonts w:ascii="Arial" w:hAnsi="Arial"/>
+          <w:sz w:val="22"/>
+        </w:rPr>
+        <w:t>по 1500 мг утром во время приёма пищи. Курс 3 месяца.</w:t>
+      </w:r>
+    </w:p>
+    <w:p>
+      <w:pPr>
+        <w:pStyle w:val="ListBullet"/>
+        <w:spacing w:before="0" w:after="60"/>
+      </w:pPr>
+      <w:r>
+        <w:rPr>
+          <w:rFonts w:ascii="Arial" w:hAnsi="Arial"/>
+          <w:b/>
+          <w:sz w:val="22"/>
+        </w:rPr>
+        <w:t xml:space="preserve">Суечинфу — </w:t>
+      </w:r>
+      <w:r>
+        <w:rPr>
+          <w:rFonts w:ascii="Arial" w:hAnsi="Arial"/>
+          <w:sz w:val="22"/>
+        </w:rPr>
+        <w:t>по 1 к 2 раза в день. Курс 2 месяца.</w:t>
       </w:r>
     </w:p>
     <w:p>

</xml_diff>